<commit_message>
006_docs: Update worklog template files
- Modified COS40005-EAT40005-Worklog-Template.md
- Updated COS40005_EAT40005_Worklog.docx template
</commit_message>
<xml_diff>
--- a/Documents/Basil's Doc/Template/WorkInProgress/COS40005_EAT40005_Worklog.docx
+++ b/Documents/Basil's Doc/Template/WorkInProgress/COS40005_EAT40005_Worklog.docx
@@ -555,11 +555,6 @@
           </w:p>
           <w:p>
             <w:pPr>
-              <w:pStyle w:val="ListParagraph"/>
-              <w:numPr>
-                <w:ilvl w:val="0"/>
-                <w:numId w:val="1"/>
-              </w:numPr>
               <w:spacing w:before="120" w:after="120"/>
               <w:rPr>
                 <w:rFonts w:ascii="Arial" w:eastAsia="Times New Roman" w:hAnsi="Arial" w:cs="Arial"/>
@@ -573,25 +568,31 @@
                 <w:b/>
                 <w:szCs w:val="20"/>
               </w:rPr>
-              <w:t xml:space="preserve">Created a </w:t>
-            </w:r>
-            <w:proofErr w:type="spellStart"/>
-            <w:r>
-              <w:rPr>
-                <w:rFonts w:ascii="Arial" w:eastAsia="Times New Roman" w:hAnsi="Arial" w:cs="Arial"/>
-                <w:b/>
-                <w:szCs w:val="20"/>
-              </w:rPr>
-              <w:t>Github</w:t>
-            </w:r>
-            <w:proofErr w:type="spellEnd"/>
-            <w:r>
-              <w:rPr>
-                <w:rFonts w:ascii="Arial" w:eastAsia="Times New Roman" w:hAnsi="Arial" w:cs="Arial"/>
-                <w:b/>
-                <w:szCs w:val="20"/>
-              </w:rPr>
-              <w:t xml:space="preserve"> Repo for our final year project </w:t>
+              <w:t xml:space="preserve">Establish the team’s </w:t>
+            </w:r>
+            <w:r>
+              <w:rPr>
+                <w:rFonts w:ascii="Arial" w:eastAsia="Times New Roman" w:hAnsi="Arial" w:cs="Arial"/>
+                <w:b/>
+                <w:szCs w:val="20"/>
+              </w:rPr>
+              <w:t>Github Repo</w:t>
+            </w:r>
+            <w:r>
+              <w:rPr>
+                <w:rFonts w:ascii="Arial" w:eastAsia="Times New Roman" w:hAnsi="Arial" w:cs="Arial"/>
+                <w:b/>
+                <w:szCs w:val="20"/>
+              </w:rPr>
+              <w:t>sitory</w:t>
+            </w:r>
+            <w:r>
+              <w:rPr>
+                <w:rFonts w:ascii="Arial" w:eastAsia="Times New Roman" w:hAnsi="Arial" w:cs="Arial"/>
+                <w:b/>
+                <w:szCs w:val="20"/>
+              </w:rPr>
+              <w:t xml:space="preserve"> for our final year project </w:t>
             </w:r>
           </w:p>
         </w:tc>
@@ -678,6 +679,48 @@
                 <w:b/>
                 <w:szCs w:val="20"/>
               </w:rPr>
+              <w:t xml:space="preserve">Chose a topic of the team’s project </w:t>
+            </w:r>
+            <w:r>
+              <w:rPr>
+                <w:rFonts w:ascii="Arial" w:eastAsia="Times New Roman" w:hAnsi="Arial" w:cs="Arial"/>
+                <w:b/>
+                <w:szCs w:val="20"/>
+              </w:rPr>
+              <w:t>and the topic title chosen is “</w:t>
+            </w:r>
+            <w:r>
+              <w:rPr>
+                <w:rFonts w:ascii="Arial" w:eastAsia="Times New Roman" w:hAnsi="Arial" w:cs="Arial"/>
+                <w:b/>
+                <w:szCs w:val="20"/>
+              </w:rPr>
+              <w:t>BioTective Digital Health Platform - AI-Enabled Chronic Disease Monitoring</w:t>
+            </w:r>
+            <w:r>
+              <w:rPr>
+                <w:rFonts w:ascii="Arial" w:eastAsia="Times New Roman" w:hAnsi="Arial" w:cs="Arial"/>
+                <w:b/>
+                <w:szCs w:val="20"/>
+              </w:rPr>
+              <w:t>”</w:t>
+            </w:r>
+          </w:p>
+          <w:p>
+            <w:pPr>
+              <w:spacing w:before="120" w:after="120"/>
+              <w:rPr>
+                <w:rFonts w:ascii="Arial" w:eastAsia="Times New Roman" w:hAnsi="Arial" w:cs="Arial"/>
+                <w:b/>
+                <w:szCs w:val="20"/>
+              </w:rPr>
+            </w:pPr>
+            <w:r>
+              <w:rPr>
+                <w:rFonts w:ascii="Arial" w:eastAsia="Times New Roman" w:hAnsi="Arial" w:cs="Arial"/>
+                <w:b/>
+                <w:szCs w:val="20"/>
+              </w:rPr>
               <w:t xml:space="preserve">Contacted the supervisor about the </w:t>
             </w:r>
             <w:r>
@@ -775,16 +818,14 @@
               </w:rPr>
               <w:t xml:space="preserve">Contact the Supervisor for </w:t>
             </w:r>
-            <w:proofErr w:type="gramStart"/>
-            <w:r>
-              <w:rPr>
-                <w:rFonts w:ascii="Arial" w:eastAsia="Times New Roman" w:hAnsi="Arial" w:cs="Arial"/>
-                <w:b/>
-                <w:szCs w:val="20"/>
-              </w:rPr>
-              <w:t>verification  and</w:t>
-            </w:r>
-            <w:proofErr w:type="gramEnd"/>
+            <w:r>
+              <w:rPr>
+                <w:rFonts w:ascii="Arial" w:eastAsia="Times New Roman" w:hAnsi="Arial" w:cs="Arial"/>
+                <w:b/>
+                <w:szCs w:val="20"/>
+              </w:rPr>
+              <w:t>verification and</w:t>
+            </w:r>
             <w:r>
               <w:rPr>
                 <w:rFonts w:ascii="Arial" w:eastAsia="Times New Roman" w:hAnsi="Arial" w:cs="Arial"/>
@@ -794,6 +835,69 @@
               <w:t xml:space="preserve"> more details of the Project</w:t>
             </w:r>
           </w:p>
+          <w:p>
+            <w:pPr>
+              <w:spacing w:before="120" w:after="120"/>
+              <w:rPr>
+                <w:rFonts w:ascii="Arial" w:eastAsia="Times New Roman" w:hAnsi="Arial" w:cs="Arial"/>
+                <w:b/>
+                <w:szCs w:val="20"/>
+              </w:rPr>
+            </w:pPr>
+            <w:r>
+              <w:rPr>
+                <w:rFonts w:ascii="Arial" w:eastAsia="Times New Roman" w:hAnsi="Arial" w:cs="Arial"/>
+                <w:b/>
+                <w:szCs w:val="20"/>
+              </w:rPr>
+              <w:br/>
+              <w:t>Created the system architecture and the technical flow of prototype</w:t>
+            </w:r>
+          </w:p>
+          <w:p>
+            <w:pPr>
+              <w:spacing w:before="120" w:after="120"/>
+              <w:rPr>
+                <w:rFonts w:ascii="Arial" w:eastAsia="Times New Roman" w:hAnsi="Arial" w:cs="Arial"/>
+                <w:b/>
+                <w:szCs w:val="20"/>
+              </w:rPr>
+            </w:pPr>
+          </w:p>
+          <w:p>
+            <w:pPr>
+              <w:spacing w:before="120" w:after="120"/>
+              <w:rPr>
+                <w:rFonts w:ascii="Arial" w:eastAsia="Times New Roman" w:hAnsi="Arial" w:cs="Arial"/>
+                <w:b/>
+                <w:szCs w:val="20"/>
+              </w:rPr>
+            </w:pPr>
+            <w:r>
+              <w:rPr>
+                <w:rFonts w:ascii="Arial" w:eastAsia="Times New Roman" w:hAnsi="Arial" w:cs="Arial"/>
+                <w:b/>
+                <w:szCs w:val="20"/>
+              </w:rPr>
+              <w:t xml:space="preserve">Researching and planning for the AI integration and the best models to </w:t>
+            </w:r>
+            <w:r>
+              <w:rPr>
+                <w:rFonts w:ascii="Arial" w:eastAsia="Times New Roman" w:hAnsi="Arial" w:cs="Arial"/>
+                <w:b/>
+                <w:szCs w:val="20"/>
+              </w:rPr>
+              <w:t>integrate</w:t>
+            </w:r>
+            <w:r>
+              <w:rPr>
+                <w:rFonts w:ascii="Arial" w:eastAsia="Times New Roman" w:hAnsi="Arial" w:cs="Arial"/>
+                <w:b/>
+                <w:szCs w:val="20"/>
+              </w:rPr>
+              <w:t xml:space="preserve"> into the prototype</w:t>
+            </w:r>
+          </w:p>
         </w:tc>
         <w:tc>
           <w:tcPr>
@@ -814,7 +918,15 @@
                 <w:b/>
                 <w:szCs w:val="20"/>
               </w:rPr>
-              <w:t>1 Hours</w:t>
+              <w:t>3</w:t>
+            </w:r>
+            <w:r>
+              <w:rPr>
+                <w:rFonts w:ascii="Arial" w:eastAsia="Times New Roman" w:hAnsi="Arial" w:cs="Arial"/>
+                <w:b/>
+                <w:szCs w:val="20"/>
+              </w:rPr>
+              <w:t xml:space="preserve"> Hours</w:t>
             </w:r>
           </w:p>
         </w:tc>
@@ -880,6 +992,14 @@
               </w:rPr>
               <w:t>Completing the Team and Project plan</w:t>
             </w:r>
+            <w:r>
+              <w:rPr>
+                <w:rFonts w:ascii="Arial" w:eastAsia="Times New Roman" w:hAnsi="Arial" w:cs="Arial"/>
+                <w:b/>
+                <w:szCs w:val="20"/>
+              </w:rPr>
+              <w:t xml:space="preserve"> and Submitting the Team Project plan report</w:t>
+            </w:r>
           </w:p>
         </w:tc>
         <w:tc>
@@ -895,6 +1015,14 @@
                 <w:szCs w:val="20"/>
               </w:rPr>
             </w:pPr>
+            <w:r>
+              <w:rPr>
+                <w:rFonts w:ascii="Arial" w:eastAsia="Times New Roman" w:hAnsi="Arial" w:cs="Arial"/>
+                <w:b/>
+                <w:szCs w:val="20"/>
+              </w:rPr>
+              <w:t>8 hours</w:t>
+            </w:r>
           </w:p>
         </w:tc>
         <w:tc>
@@ -934,6 +1062,7 @@
                 <w:bCs/>
                 <w:szCs w:val="20"/>
               </w:rPr>
+              <w:lastRenderedPageBreak/>
               <w:t>5</w:t>
             </w:r>
           </w:p>
@@ -951,6 +1080,138 @@
                 <w:szCs w:val="20"/>
               </w:rPr>
             </w:pPr>
+            <w:r>
+              <w:rPr>
+                <w:rFonts w:ascii="Arial" w:eastAsia="Times New Roman" w:hAnsi="Arial" w:cs="Arial"/>
+                <w:b/>
+                <w:szCs w:val="20"/>
+              </w:rPr>
+              <w:t xml:space="preserve">AI Backend Development </w:t>
+            </w:r>
+            <w:r>
+              <w:rPr>
+                <w:rFonts w:ascii="Arial" w:eastAsia="Times New Roman" w:hAnsi="Arial" w:cs="Arial"/>
+                <w:b/>
+                <w:szCs w:val="20"/>
+              </w:rPr>
+              <w:t>–</w:t>
+            </w:r>
+            <w:r>
+              <w:rPr>
+                <w:rFonts w:ascii="Arial" w:eastAsia="Times New Roman" w:hAnsi="Arial" w:cs="Arial"/>
+                <w:b/>
+                <w:szCs w:val="20"/>
+              </w:rPr>
+              <w:t xml:space="preserve"> </w:t>
+            </w:r>
+            <w:r>
+              <w:rPr>
+                <w:rFonts w:ascii="Arial" w:eastAsia="Times New Roman" w:hAnsi="Arial" w:cs="Arial"/>
+                <w:b/>
+                <w:szCs w:val="20"/>
+              </w:rPr>
+              <w:t xml:space="preserve">Understanding the Supabase </w:t>
+            </w:r>
+            <w:r>
+              <w:rPr>
+                <w:rFonts w:ascii="Arial" w:eastAsia="Times New Roman" w:hAnsi="Arial" w:cs="Arial"/>
+                <w:b/>
+                <w:szCs w:val="20"/>
+              </w:rPr>
+              <w:t>database</w:t>
+            </w:r>
+            <w:r>
+              <w:rPr>
+                <w:rFonts w:ascii="Arial" w:eastAsia="Times New Roman" w:hAnsi="Arial" w:cs="Arial"/>
+                <w:b/>
+                <w:szCs w:val="20"/>
+              </w:rPr>
+              <w:t xml:space="preserve"> to populate it with data</w:t>
+            </w:r>
+            <w:r>
+              <w:rPr>
+                <w:rFonts w:ascii="Arial" w:eastAsia="Times New Roman" w:hAnsi="Arial" w:cs="Arial"/>
+                <w:b/>
+                <w:szCs w:val="20"/>
+              </w:rPr>
+              <w:t xml:space="preserve">, </w:t>
+            </w:r>
+          </w:p>
+          <w:p>
+            <w:pPr>
+              <w:spacing w:before="120" w:after="120"/>
+              <w:rPr>
+                <w:rFonts w:ascii="Arial" w:eastAsia="Times New Roman" w:hAnsi="Arial" w:cs="Arial"/>
+                <w:b/>
+                <w:szCs w:val="20"/>
+              </w:rPr>
+            </w:pPr>
+            <w:r>
+              <w:rPr>
+                <w:rFonts w:ascii="Arial" w:eastAsia="Times New Roman" w:hAnsi="Arial" w:cs="Arial"/>
+                <w:b/>
+                <w:szCs w:val="20"/>
+              </w:rPr>
+              <w:t>implemented DeepSeek-V3.1 integration</w:t>
+            </w:r>
+            <w:r>
+              <w:rPr>
+                <w:rFonts w:ascii="Arial" w:eastAsia="Times New Roman" w:hAnsi="Arial" w:cs="Arial"/>
+                <w:b/>
+                <w:szCs w:val="20"/>
+              </w:rPr>
+              <w:t xml:space="preserve"> Chatbot</w:t>
+            </w:r>
+          </w:p>
+          <w:p>
+            <w:pPr>
+              <w:spacing w:before="120" w:after="120"/>
+              <w:rPr>
+                <w:rFonts w:ascii="Arial" w:eastAsia="Times New Roman" w:hAnsi="Arial" w:cs="Arial"/>
+                <w:b/>
+                <w:szCs w:val="20"/>
+              </w:rPr>
+            </w:pPr>
+            <w:r>
+              <w:rPr>
+                <w:rFonts w:ascii="Arial" w:eastAsia="Times New Roman" w:hAnsi="Arial" w:cs="Arial"/>
+                <w:b/>
+                <w:szCs w:val="20"/>
+              </w:rPr>
+              <w:t>created</w:t>
+            </w:r>
+            <w:r>
+              <w:rPr>
+                <w:rFonts w:ascii="Arial" w:eastAsia="Times New Roman" w:hAnsi="Arial" w:cs="Arial"/>
+                <w:b/>
+                <w:szCs w:val="20"/>
+              </w:rPr>
+              <w:t xml:space="preserve"> a different G</w:t>
+            </w:r>
+            <w:r>
+              <w:rPr>
+                <w:rFonts w:ascii="Arial" w:eastAsia="Times New Roman" w:hAnsi="Arial" w:cs="Arial"/>
+                <w:b/>
+                <w:szCs w:val="20"/>
+              </w:rPr>
+              <w:t>it</w:t>
+            </w:r>
+            <w:r>
+              <w:rPr>
+                <w:rFonts w:ascii="Arial" w:eastAsia="Times New Roman" w:hAnsi="Arial" w:cs="Arial"/>
+                <w:b/>
+                <w:szCs w:val="20"/>
+              </w:rPr>
+              <w:t>hub branch and test out the</w:t>
+            </w:r>
+            <w:r>
+              <w:rPr>
+                <w:rFonts w:ascii="Arial" w:eastAsia="Times New Roman" w:hAnsi="Arial" w:cs="Arial"/>
+                <w:b/>
+                <w:szCs w:val="20"/>
+              </w:rPr>
+              <w:t xml:space="preserve"> AI service architecture</w:t>
+            </w:r>
           </w:p>
         </w:tc>
         <w:tc>
@@ -966,6 +1227,22 @@
                 <w:szCs w:val="20"/>
               </w:rPr>
             </w:pPr>
+            <w:r>
+              <w:rPr>
+                <w:rFonts w:ascii="Arial" w:eastAsia="Times New Roman" w:hAnsi="Arial" w:cs="Arial"/>
+                <w:b/>
+                <w:szCs w:val="20"/>
+              </w:rPr>
+              <w:t>17</w:t>
+            </w:r>
+            <w:r>
+              <w:rPr>
+                <w:rFonts w:ascii="Arial" w:eastAsia="Times New Roman" w:hAnsi="Arial" w:cs="Arial"/>
+                <w:b/>
+                <w:szCs w:val="20"/>
+              </w:rPr>
+              <w:t xml:space="preserve"> Hours</w:t>
+            </w:r>
           </w:p>
         </w:tc>
         <w:tc>
@@ -1022,6 +1299,30 @@
                 <w:szCs w:val="20"/>
               </w:rPr>
             </w:pPr>
+            <w:r>
+              <w:rPr>
+                <w:rFonts w:ascii="Arial" w:eastAsia="Times New Roman" w:hAnsi="Arial" w:cs="Arial"/>
+                <w:b/>
+                <w:szCs w:val="20"/>
+              </w:rPr>
+              <w:t>Completing the Worklog report, Sprint report, and the Resear</w:t>
+            </w:r>
+            <w:r>
+              <w:rPr>
+                <w:rFonts w:ascii="Arial" w:eastAsia="Times New Roman" w:hAnsi="Arial" w:cs="Arial"/>
+                <w:b/>
+                <w:szCs w:val="20"/>
+              </w:rPr>
+              <w:t>c</w:t>
+            </w:r>
+            <w:r>
+              <w:rPr>
+                <w:rFonts w:ascii="Arial" w:eastAsia="Times New Roman" w:hAnsi="Arial" w:cs="Arial"/>
+                <w:b/>
+                <w:szCs w:val="20"/>
+              </w:rPr>
+              <w:t>h report the project</w:t>
+            </w:r>
           </w:p>
         </w:tc>
         <w:tc>
@@ -1037,6 +1338,14 @@
                 <w:szCs w:val="20"/>
               </w:rPr>
             </w:pPr>
+            <w:r>
+              <w:rPr>
+                <w:rFonts w:ascii="Arial" w:eastAsia="Times New Roman" w:hAnsi="Arial" w:cs="Arial"/>
+                <w:b/>
+                <w:szCs w:val="20"/>
+              </w:rPr>
+              <w:t>18 Hours</w:t>
+            </w:r>
           </w:p>
         </w:tc>
         <w:tc>
@@ -2042,18 +2351,8 @@
                 <w:sz w:val="20"/>
                 <w:szCs w:val="20"/>
               </w:rPr>
-              <w:t xml:space="preserve">Check with </w:t>
-            </w:r>
-            <w:proofErr w:type="spellStart"/>
-            <w:r>
-              <w:rPr>
-                <w:rFonts w:ascii="Arial" w:eastAsia="Times New Roman" w:hAnsi="Arial" w:cs="Arial"/>
-                <w:sz w:val="20"/>
-                <w:szCs w:val="20"/>
-              </w:rPr>
-              <w:t>xyz</w:t>
-            </w:r>
-            <w:proofErr w:type="spellEnd"/>
+              <w:t>Check with xyz</w:t>
+            </w:r>
           </w:p>
         </w:tc>
       </w:tr>
@@ -2377,29 +2676,7 @@
           <w:color w:val="000000"/>
           <w:lang w:eastAsia="en-AU"/>
         </w:rPr>
-        <w:t xml:space="preserve">any literature </w:t>
-      </w:r>
-      <w:proofErr w:type="gramStart"/>
-      <w:r>
-        <w:rPr>
-          <w:rFonts w:ascii="Arial" w:eastAsia="Times New Roman" w:hAnsi="Arial" w:cs="Arial"/>
-          <w:i/>
-          <w:iCs/>
-          <w:color w:val="000000"/>
-          <w:lang w:eastAsia="en-AU"/>
-        </w:rPr>
-        <w:t>read</w:t>
-      </w:r>
-      <w:proofErr w:type="gramEnd"/>
-      <w:r>
-        <w:rPr>
-          <w:rFonts w:ascii="Arial" w:eastAsia="Times New Roman" w:hAnsi="Arial" w:cs="Arial"/>
-          <w:i/>
-          <w:iCs/>
-          <w:color w:val="000000"/>
-          <w:lang w:eastAsia="en-AU"/>
-        </w:rPr>
-        <w:t xml:space="preserve"> and key things learned</w:t>
+        <w:t>any literature read and key things learned</w:t>
       </w:r>
     </w:p>
     <w:p>
@@ -3099,18 +3376,8 @@
                 <w:sz w:val="20"/>
                 <w:szCs w:val="20"/>
               </w:rPr>
-              <w:t xml:space="preserve">Check with </w:t>
-            </w:r>
-            <w:proofErr w:type="spellStart"/>
-            <w:r>
-              <w:rPr>
-                <w:rFonts w:ascii="Arial" w:eastAsia="Times New Roman" w:hAnsi="Arial" w:cs="Arial"/>
-                <w:sz w:val="20"/>
-                <w:szCs w:val="20"/>
-              </w:rPr>
-              <w:t>xyz</w:t>
-            </w:r>
-            <w:proofErr w:type="spellEnd"/>
+              <w:t>Check with xyz</w:t>
+            </w:r>
           </w:p>
         </w:tc>
       </w:tr>
@@ -3434,29 +3701,7 @@
           <w:color w:val="000000"/>
           <w:lang w:eastAsia="en-AU"/>
         </w:rPr>
-        <w:t xml:space="preserve">any literature </w:t>
-      </w:r>
-      <w:proofErr w:type="gramStart"/>
-      <w:r>
-        <w:rPr>
-          <w:rFonts w:ascii="Arial" w:eastAsia="Times New Roman" w:hAnsi="Arial" w:cs="Arial"/>
-          <w:i/>
-          <w:iCs/>
-          <w:color w:val="000000"/>
-          <w:lang w:eastAsia="en-AU"/>
-        </w:rPr>
-        <w:t>read</w:t>
-      </w:r>
-      <w:proofErr w:type="gramEnd"/>
-      <w:r>
-        <w:rPr>
-          <w:rFonts w:ascii="Arial" w:eastAsia="Times New Roman" w:hAnsi="Arial" w:cs="Arial"/>
-          <w:i/>
-          <w:iCs/>
-          <w:color w:val="000000"/>
-          <w:lang w:eastAsia="en-AU"/>
-        </w:rPr>
-        <w:t xml:space="preserve"> and key things learned</w:t>
+        <w:t>any literature read and key things learned</w:t>
       </w:r>
     </w:p>
     <w:p>
@@ -4162,18 +4407,8 @@
                 <w:sz w:val="20"/>
                 <w:szCs w:val="20"/>
               </w:rPr>
-              <w:t xml:space="preserve">Check with </w:t>
-            </w:r>
-            <w:proofErr w:type="spellStart"/>
-            <w:r>
-              <w:rPr>
-                <w:rFonts w:ascii="Arial" w:eastAsia="Times New Roman" w:hAnsi="Arial" w:cs="Arial"/>
-                <w:sz w:val="20"/>
-                <w:szCs w:val="20"/>
-              </w:rPr>
-              <w:t>xyz</w:t>
-            </w:r>
-            <w:proofErr w:type="spellEnd"/>
+              <w:t>Check with xyz</w:t>
+            </w:r>
           </w:p>
         </w:tc>
       </w:tr>
@@ -4497,29 +4732,7 @@
           <w:color w:val="000000"/>
           <w:lang w:eastAsia="en-AU"/>
         </w:rPr>
-        <w:t xml:space="preserve">any literature </w:t>
-      </w:r>
-      <w:proofErr w:type="gramStart"/>
-      <w:r>
-        <w:rPr>
-          <w:rFonts w:ascii="Arial" w:eastAsia="Times New Roman" w:hAnsi="Arial" w:cs="Arial"/>
-          <w:i/>
-          <w:iCs/>
-          <w:color w:val="000000"/>
-          <w:lang w:eastAsia="en-AU"/>
-        </w:rPr>
-        <w:t>read</w:t>
-      </w:r>
-      <w:proofErr w:type="gramEnd"/>
-      <w:r>
-        <w:rPr>
-          <w:rFonts w:ascii="Arial" w:eastAsia="Times New Roman" w:hAnsi="Arial" w:cs="Arial"/>
-          <w:i/>
-          <w:iCs/>
-          <w:color w:val="000000"/>
-          <w:lang w:eastAsia="en-AU"/>
-        </w:rPr>
-        <w:t xml:space="preserve"> and key things learned</w:t>
+        <w:t>any literature read and key things learned</w:t>
       </w:r>
     </w:p>
     <w:p>
@@ -5219,18 +5432,8 @@
                 <w:sz w:val="20"/>
                 <w:szCs w:val="20"/>
               </w:rPr>
-              <w:t xml:space="preserve">Check with </w:t>
-            </w:r>
-            <w:proofErr w:type="spellStart"/>
-            <w:r>
-              <w:rPr>
-                <w:rFonts w:ascii="Arial" w:eastAsia="Times New Roman" w:hAnsi="Arial" w:cs="Arial"/>
-                <w:sz w:val="20"/>
-                <w:szCs w:val="20"/>
-              </w:rPr>
-              <w:t>xyz</w:t>
-            </w:r>
-            <w:proofErr w:type="spellEnd"/>
+              <w:t>Check with xyz</w:t>
+            </w:r>
           </w:p>
         </w:tc>
       </w:tr>
@@ -5554,29 +5757,7 @@
           <w:color w:val="000000"/>
           <w:lang w:eastAsia="en-AU"/>
         </w:rPr>
-        <w:t xml:space="preserve">any literature </w:t>
-      </w:r>
-      <w:proofErr w:type="gramStart"/>
-      <w:r>
-        <w:rPr>
-          <w:rFonts w:ascii="Arial" w:eastAsia="Times New Roman" w:hAnsi="Arial" w:cs="Arial"/>
-          <w:i/>
-          <w:iCs/>
-          <w:color w:val="000000"/>
-          <w:lang w:eastAsia="en-AU"/>
-        </w:rPr>
-        <w:t>read</w:t>
-      </w:r>
-      <w:proofErr w:type="gramEnd"/>
-      <w:r>
-        <w:rPr>
-          <w:rFonts w:ascii="Arial" w:eastAsia="Times New Roman" w:hAnsi="Arial" w:cs="Arial"/>
-          <w:i/>
-          <w:iCs/>
-          <w:color w:val="000000"/>
-          <w:lang w:eastAsia="en-AU"/>
-        </w:rPr>
-        <w:t xml:space="preserve"> and key things learned</w:t>
+        <w:t>any literature read and key things learned</w:t>
       </w:r>
     </w:p>
     <w:p>
@@ -6276,18 +6457,8 @@
                 <w:sz w:val="20"/>
                 <w:szCs w:val="20"/>
               </w:rPr>
-              <w:t xml:space="preserve">Check with </w:t>
-            </w:r>
-            <w:proofErr w:type="spellStart"/>
-            <w:r>
-              <w:rPr>
-                <w:rFonts w:ascii="Arial" w:eastAsia="Times New Roman" w:hAnsi="Arial" w:cs="Arial"/>
-                <w:sz w:val="20"/>
-                <w:szCs w:val="20"/>
-              </w:rPr>
-              <w:t>xyz</w:t>
-            </w:r>
-            <w:proofErr w:type="spellEnd"/>
+              <w:t>Check with xyz</w:t>
+            </w:r>
           </w:p>
         </w:tc>
       </w:tr>
@@ -6611,29 +6782,7 @@
           <w:color w:val="000000"/>
           <w:lang w:eastAsia="en-AU"/>
         </w:rPr>
-        <w:t xml:space="preserve">any literature </w:t>
-      </w:r>
-      <w:proofErr w:type="gramStart"/>
-      <w:r>
-        <w:rPr>
-          <w:rFonts w:ascii="Arial" w:eastAsia="Times New Roman" w:hAnsi="Arial" w:cs="Arial"/>
-          <w:i/>
-          <w:iCs/>
-          <w:color w:val="000000"/>
-          <w:lang w:eastAsia="en-AU"/>
-        </w:rPr>
-        <w:t>read</w:t>
-      </w:r>
-      <w:proofErr w:type="gramEnd"/>
-      <w:r>
-        <w:rPr>
-          <w:rFonts w:ascii="Arial" w:eastAsia="Times New Roman" w:hAnsi="Arial" w:cs="Arial"/>
-          <w:i/>
-          <w:iCs/>
-          <w:color w:val="000000"/>
-          <w:lang w:eastAsia="en-AU"/>
-        </w:rPr>
-        <w:t xml:space="preserve"> and key things learned</w:t>
+        <w:t>any literature read and key things learned</w:t>
       </w:r>
     </w:p>
     <w:p>
@@ -7333,18 +7482,8 @@
                 <w:sz w:val="20"/>
                 <w:szCs w:val="20"/>
               </w:rPr>
-              <w:t xml:space="preserve">Check with </w:t>
-            </w:r>
-            <w:proofErr w:type="spellStart"/>
-            <w:r>
-              <w:rPr>
-                <w:rFonts w:ascii="Arial" w:eastAsia="Times New Roman" w:hAnsi="Arial" w:cs="Arial"/>
-                <w:sz w:val="20"/>
-                <w:szCs w:val="20"/>
-              </w:rPr>
-              <w:t>xyz</w:t>
-            </w:r>
-            <w:proofErr w:type="spellEnd"/>
+              <w:t>Check with xyz</w:t>
+            </w:r>
           </w:p>
         </w:tc>
       </w:tr>
@@ -7668,29 +7807,7 @@
           <w:color w:val="000000"/>
           <w:lang w:eastAsia="en-AU"/>
         </w:rPr>
-        <w:t xml:space="preserve">any literature </w:t>
-      </w:r>
-      <w:proofErr w:type="gramStart"/>
-      <w:r>
-        <w:rPr>
-          <w:rFonts w:ascii="Arial" w:eastAsia="Times New Roman" w:hAnsi="Arial" w:cs="Arial"/>
-          <w:i/>
-          <w:iCs/>
-          <w:color w:val="000000"/>
-          <w:lang w:eastAsia="en-AU"/>
-        </w:rPr>
-        <w:t>read</w:t>
-      </w:r>
-      <w:proofErr w:type="gramEnd"/>
-      <w:r>
-        <w:rPr>
-          <w:rFonts w:ascii="Arial" w:eastAsia="Times New Roman" w:hAnsi="Arial" w:cs="Arial"/>
-          <w:i/>
-          <w:iCs/>
-          <w:color w:val="000000"/>
-          <w:lang w:eastAsia="en-AU"/>
-        </w:rPr>
-        <w:t xml:space="preserve"> and key things learned</w:t>
+        <w:t>any literature read and key things learned</w:t>
       </w:r>
     </w:p>
     <w:p>
@@ -8390,18 +8507,8 @@
                 <w:sz w:val="20"/>
                 <w:szCs w:val="20"/>
               </w:rPr>
-              <w:t xml:space="preserve">Check with </w:t>
-            </w:r>
-            <w:proofErr w:type="spellStart"/>
-            <w:r>
-              <w:rPr>
-                <w:rFonts w:ascii="Arial" w:eastAsia="Times New Roman" w:hAnsi="Arial" w:cs="Arial"/>
-                <w:sz w:val="20"/>
-                <w:szCs w:val="20"/>
-              </w:rPr>
-              <w:t>xyz</w:t>
-            </w:r>
-            <w:proofErr w:type="spellEnd"/>
+              <w:t>Check with xyz</w:t>
+            </w:r>
           </w:p>
         </w:tc>
       </w:tr>
@@ -8725,29 +8832,7 @@
           <w:color w:val="000000"/>
           <w:lang w:eastAsia="en-AU"/>
         </w:rPr>
-        <w:t xml:space="preserve">any literature </w:t>
-      </w:r>
-      <w:proofErr w:type="gramStart"/>
-      <w:r>
-        <w:rPr>
-          <w:rFonts w:ascii="Arial" w:eastAsia="Times New Roman" w:hAnsi="Arial" w:cs="Arial"/>
-          <w:i/>
-          <w:iCs/>
-          <w:color w:val="000000"/>
-          <w:lang w:eastAsia="en-AU"/>
-        </w:rPr>
-        <w:t>read</w:t>
-      </w:r>
-      <w:proofErr w:type="gramEnd"/>
-      <w:r>
-        <w:rPr>
-          <w:rFonts w:ascii="Arial" w:eastAsia="Times New Roman" w:hAnsi="Arial" w:cs="Arial"/>
-          <w:i/>
-          <w:iCs/>
-          <w:color w:val="000000"/>
-          <w:lang w:eastAsia="en-AU"/>
-        </w:rPr>
-        <w:t xml:space="preserve"> and key things learned</w:t>
+        <w:t>any literature read and key things learned</w:t>
       </w:r>
     </w:p>
     <w:p>
@@ -9447,18 +9532,8 @@
                 <w:sz w:val="20"/>
                 <w:szCs w:val="20"/>
               </w:rPr>
-              <w:t xml:space="preserve">Check with </w:t>
-            </w:r>
-            <w:proofErr w:type="spellStart"/>
-            <w:r>
-              <w:rPr>
-                <w:rFonts w:ascii="Arial" w:eastAsia="Times New Roman" w:hAnsi="Arial" w:cs="Arial"/>
-                <w:sz w:val="20"/>
-                <w:szCs w:val="20"/>
-              </w:rPr>
-              <w:t>xyz</w:t>
-            </w:r>
-            <w:proofErr w:type="spellEnd"/>
+              <w:t>Check with xyz</w:t>
+            </w:r>
           </w:p>
         </w:tc>
       </w:tr>
@@ -9782,29 +9857,7 @@
           <w:color w:val="000000"/>
           <w:lang w:eastAsia="en-AU"/>
         </w:rPr>
-        <w:t xml:space="preserve">any literature </w:t>
-      </w:r>
-      <w:proofErr w:type="gramStart"/>
-      <w:r>
-        <w:rPr>
-          <w:rFonts w:ascii="Arial" w:eastAsia="Times New Roman" w:hAnsi="Arial" w:cs="Arial"/>
-          <w:i/>
-          <w:iCs/>
-          <w:color w:val="000000"/>
-          <w:lang w:eastAsia="en-AU"/>
-        </w:rPr>
-        <w:t>read</w:t>
-      </w:r>
-      <w:proofErr w:type="gramEnd"/>
-      <w:r>
-        <w:rPr>
-          <w:rFonts w:ascii="Arial" w:eastAsia="Times New Roman" w:hAnsi="Arial" w:cs="Arial"/>
-          <w:i/>
-          <w:iCs/>
-          <w:color w:val="000000"/>
-          <w:lang w:eastAsia="en-AU"/>
-        </w:rPr>
-        <w:t xml:space="preserve"> and key things learned</w:t>
+        <w:t>any literature read and key things learned</w:t>
       </w:r>
     </w:p>
     <w:p>
@@ -10504,18 +10557,8 @@
                 <w:sz w:val="20"/>
                 <w:szCs w:val="20"/>
               </w:rPr>
-              <w:t xml:space="preserve">Check with </w:t>
-            </w:r>
-            <w:proofErr w:type="spellStart"/>
-            <w:r>
-              <w:rPr>
-                <w:rFonts w:ascii="Arial" w:eastAsia="Times New Roman" w:hAnsi="Arial" w:cs="Arial"/>
-                <w:sz w:val="20"/>
-                <w:szCs w:val="20"/>
-              </w:rPr>
-              <w:t>xyz</w:t>
-            </w:r>
-            <w:proofErr w:type="spellEnd"/>
+              <w:t>Check with xyz</w:t>
+            </w:r>
           </w:p>
         </w:tc>
       </w:tr>
@@ -10839,29 +10882,7 @@
           <w:color w:val="000000"/>
           <w:lang w:eastAsia="en-AU"/>
         </w:rPr>
-        <w:t xml:space="preserve">any literature </w:t>
-      </w:r>
-      <w:proofErr w:type="gramStart"/>
-      <w:r>
-        <w:rPr>
-          <w:rFonts w:ascii="Arial" w:eastAsia="Times New Roman" w:hAnsi="Arial" w:cs="Arial"/>
-          <w:i/>
-          <w:iCs/>
-          <w:color w:val="000000"/>
-          <w:lang w:eastAsia="en-AU"/>
-        </w:rPr>
-        <w:t>read</w:t>
-      </w:r>
-      <w:proofErr w:type="gramEnd"/>
-      <w:r>
-        <w:rPr>
-          <w:rFonts w:ascii="Arial" w:eastAsia="Times New Roman" w:hAnsi="Arial" w:cs="Arial"/>
-          <w:i/>
-          <w:iCs/>
-          <w:color w:val="000000"/>
-          <w:lang w:eastAsia="en-AU"/>
-        </w:rPr>
-        <w:t xml:space="preserve"> and key things learned</w:t>
+        <w:t>any literature read and key things learned</w:t>
       </w:r>
     </w:p>
     <w:p>
@@ -11570,18 +11591,8 @@
                 <w:sz w:val="20"/>
                 <w:szCs w:val="20"/>
               </w:rPr>
-              <w:t xml:space="preserve">Check with </w:t>
-            </w:r>
-            <w:proofErr w:type="spellStart"/>
-            <w:r>
-              <w:rPr>
-                <w:rFonts w:ascii="Arial" w:eastAsia="Times New Roman" w:hAnsi="Arial" w:cs="Arial"/>
-                <w:sz w:val="20"/>
-                <w:szCs w:val="20"/>
-              </w:rPr>
-              <w:t>xyz</w:t>
-            </w:r>
-            <w:proofErr w:type="spellEnd"/>
+              <w:t>Check with xyz</w:t>
+            </w:r>
           </w:p>
         </w:tc>
       </w:tr>
@@ -11905,29 +11916,7 @@
           <w:color w:val="000000"/>
           <w:lang w:eastAsia="en-AU"/>
         </w:rPr>
-        <w:t xml:space="preserve">any literature </w:t>
-      </w:r>
-      <w:proofErr w:type="gramStart"/>
-      <w:r>
-        <w:rPr>
-          <w:rFonts w:ascii="Arial" w:eastAsia="Times New Roman" w:hAnsi="Arial" w:cs="Arial"/>
-          <w:i/>
-          <w:iCs/>
-          <w:color w:val="000000"/>
-          <w:lang w:eastAsia="en-AU"/>
-        </w:rPr>
-        <w:t>read</w:t>
-      </w:r>
-      <w:proofErr w:type="gramEnd"/>
-      <w:r>
-        <w:rPr>
-          <w:rFonts w:ascii="Arial" w:eastAsia="Times New Roman" w:hAnsi="Arial" w:cs="Arial"/>
-          <w:i/>
-          <w:iCs/>
-          <w:color w:val="000000"/>
-          <w:lang w:eastAsia="en-AU"/>
-        </w:rPr>
-        <w:t xml:space="preserve"> and key things learned</w:t>
+        <w:t>any literature read and key things learned</w:t>
       </w:r>
     </w:p>
     <w:p>
@@ -12636,18 +12625,8 @@
                 <w:sz w:val="20"/>
                 <w:szCs w:val="20"/>
               </w:rPr>
-              <w:t xml:space="preserve">Check with </w:t>
-            </w:r>
-            <w:proofErr w:type="spellStart"/>
-            <w:r>
-              <w:rPr>
-                <w:rFonts w:ascii="Arial" w:eastAsia="Times New Roman" w:hAnsi="Arial" w:cs="Arial"/>
-                <w:sz w:val="20"/>
-                <w:szCs w:val="20"/>
-              </w:rPr>
-              <w:t>xyz</w:t>
-            </w:r>
-            <w:proofErr w:type="spellEnd"/>
+              <w:t>Check with xyz</w:t>
+            </w:r>
           </w:p>
         </w:tc>
       </w:tr>
@@ -12971,29 +12950,7 @@
           <w:color w:val="000000"/>
           <w:lang w:eastAsia="en-AU"/>
         </w:rPr>
-        <w:t xml:space="preserve">any literature </w:t>
-      </w:r>
-      <w:proofErr w:type="gramStart"/>
-      <w:r>
-        <w:rPr>
-          <w:rFonts w:ascii="Arial" w:eastAsia="Times New Roman" w:hAnsi="Arial" w:cs="Arial"/>
-          <w:i/>
-          <w:iCs/>
-          <w:color w:val="000000"/>
-          <w:lang w:eastAsia="en-AU"/>
-        </w:rPr>
-        <w:t>read</w:t>
-      </w:r>
-      <w:proofErr w:type="gramEnd"/>
-      <w:r>
-        <w:rPr>
-          <w:rFonts w:ascii="Arial" w:eastAsia="Times New Roman" w:hAnsi="Arial" w:cs="Arial"/>
-          <w:i/>
-          <w:iCs/>
-          <w:color w:val="000000"/>
-          <w:lang w:eastAsia="en-AU"/>
-        </w:rPr>
-        <w:t xml:space="preserve"> and key things learned</w:t>
+        <w:t>any literature read and key things learned</w:t>
       </w:r>
     </w:p>
     <w:p>
@@ -13702,18 +13659,8 @@
                 <w:sz w:val="20"/>
                 <w:szCs w:val="20"/>
               </w:rPr>
-              <w:t xml:space="preserve">Check with </w:t>
-            </w:r>
-            <w:proofErr w:type="spellStart"/>
-            <w:r>
-              <w:rPr>
-                <w:rFonts w:ascii="Arial" w:eastAsia="Times New Roman" w:hAnsi="Arial" w:cs="Arial"/>
-                <w:sz w:val="20"/>
-                <w:szCs w:val="20"/>
-              </w:rPr>
-              <w:t>xyz</w:t>
-            </w:r>
-            <w:proofErr w:type="spellEnd"/>
+              <w:t>Check with xyz</w:t>
+            </w:r>
           </w:p>
         </w:tc>
       </w:tr>
@@ -14037,29 +13984,7 @@
           <w:color w:val="000000"/>
           <w:lang w:eastAsia="en-AU"/>
         </w:rPr>
-        <w:t xml:space="preserve">any literature </w:t>
-      </w:r>
-      <w:proofErr w:type="gramStart"/>
-      <w:r>
-        <w:rPr>
-          <w:rFonts w:ascii="Arial" w:eastAsia="Times New Roman" w:hAnsi="Arial" w:cs="Arial"/>
-          <w:i/>
-          <w:iCs/>
-          <w:color w:val="000000"/>
-          <w:lang w:eastAsia="en-AU"/>
-        </w:rPr>
-        <w:t>read</w:t>
-      </w:r>
-      <w:proofErr w:type="gramEnd"/>
-      <w:r>
-        <w:rPr>
-          <w:rFonts w:ascii="Arial" w:eastAsia="Times New Roman" w:hAnsi="Arial" w:cs="Arial"/>
-          <w:i/>
-          <w:iCs/>
-          <w:color w:val="000000"/>
-          <w:lang w:eastAsia="en-AU"/>
-        </w:rPr>
-        <w:t xml:space="preserve"> and key things learned</w:t>
+        <w:t>any literature read and key things learned</w:t>
       </w:r>
     </w:p>
     <w:p>
@@ -14839,7 +14764,6 @@
       </w:rPr>
       <w:t xml:space="preserve"> </w:t>
     </w:r>
-    <w:proofErr w:type="spellStart"/>
     <w:r>
       <w:rPr>
         <w:rFonts w:ascii="Arial" w:eastAsia="Times New Roman" w:hAnsi="Arial" w:cs="Arial"/>
@@ -14851,7 +14775,6 @@
       </w:rPr>
       <w:t>A</w:t>
     </w:r>
-    <w:proofErr w:type="spellEnd"/>
     <w:r>
       <w:rPr>
         <w:rFonts w:ascii="Arial" w:eastAsia="Times New Roman" w:hAnsi="Arial" w:cs="Arial"/>
@@ -15408,7 +15331,6 @@
   <w:style w:type="character" w:default="1" w:styleId="DefaultParagraphFont">
     <w:name w:val="Default Paragraph Font"/>
     <w:uiPriority w:val="1"/>
-    <w:semiHidden/>
     <w:unhideWhenUsed/>
   </w:style>
   <w:style w:type="table" w:default="1" w:styleId="TableNormal">

</xml_diff>

<commit_message>
007_docs: Further updates to worklog template files
- Enhanced COS40005-EAT40005-Worklog-Template.md content
- Refined COS40005_EAT40005_Worklog.docx template structure
</commit_message>
<xml_diff>
--- a/Documents/Basil's Doc/Template/WorkInProgress/COS40005_EAT40005_Worklog.docx
+++ b/Documents/Basil's Doc/Template/WorkInProgress/COS40005_EAT40005_Worklog.docx
@@ -570,13 +570,23 @@
               </w:rPr>
               <w:t xml:space="preserve">Establish the team’s </w:t>
             </w:r>
-            <w:r>
-              <w:rPr>
-                <w:rFonts w:ascii="Arial" w:eastAsia="Times New Roman" w:hAnsi="Arial" w:cs="Arial"/>
-                <w:b/>
-                <w:szCs w:val="20"/>
-              </w:rPr>
-              <w:t>Github Repo</w:t>
+            <w:proofErr w:type="spellStart"/>
+            <w:r>
+              <w:rPr>
+                <w:rFonts w:ascii="Arial" w:eastAsia="Times New Roman" w:hAnsi="Arial" w:cs="Arial"/>
+                <w:b/>
+                <w:szCs w:val="20"/>
+              </w:rPr>
+              <w:t>Github</w:t>
+            </w:r>
+            <w:proofErr w:type="spellEnd"/>
+            <w:r>
+              <w:rPr>
+                <w:rFonts w:ascii="Arial" w:eastAsia="Times New Roman" w:hAnsi="Arial" w:cs="Arial"/>
+                <w:b/>
+                <w:szCs w:val="20"/>
+              </w:rPr>
+              <w:t xml:space="preserve"> Repo</w:t>
             </w:r>
             <w:r>
               <w:rPr>
@@ -689,13 +699,23 @@
               </w:rPr>
               <w:t>and the topic title chosen is “</w:t>
             </w:r>
-            <w:r>
-              <w:rPr>
-                <w:rFonts w:ascii="Arial" w:eastAsia="Times New Roman" w:hAnsi="Arial" w:cs="Arial"/>
-                <w:b/>
-                <w:szCs w:val="20"/>
-              </w:rPr>
-              <w:t>BioTective Digital Health Platform - AI-Enabled Chronic Disease Monitoring</w:t>
+            <w:proofErr w:type="spellStart"/>
+            <w:r>
+              <w:rPr>
+                <w:rFonts w:ascii="Arial" w:eastAsia="Times New Roman" w:hAnsi="Arial" w:cs="Arial"/>
+                <w:b/>
+                <w:szCs w:val="20"/>
+              </w:rPr>
+              <w:t>BioTective</w:t>
+            </w:r>
+            <w:proofErr w:type="spellEnd"/>
+            <w:r>
+              <w:rPr>
+                <w:rFonts w:ascii="Arial" w:eastAsia="Times New Roman" w:hAnsi="Arial" w:cs="Arial"/>
+                <w:b/>
+                <w:szCs w:val="20"/>
+              </w:rPr>
+              <w:t xml:space="preserve"> Digital Health Platform - AI-Enabled Chronic Disease Monitoring</w:t>
             </w:r>
             <w:r>
               <w:rPr>
@@ -1110,7 +1130,25 @@
                 <w:b/>
                 <w:szCs w:val="20"/>
               </w:rPr>
-              <w:t xml:space="preserve">Understanding the Supabase </w:t>
+              <w:t xml:space="preserve">Understanding the </w:t>
+            </w:r>
+            <w:proofErr w:type="spellStart"/>
+            <w:r>
+              <w:rPr>
+                <w:rFonts w:ascii="Arial" w:eastAsia="Times New Roman" w:hAnsi="Arial" w:cs="Arial"/>
+                <w:b/>
+                <w:szCs w:val="20"/>
+              </w:rPr>
+              <w:t>Supabase</w:t>
+            </w:r>
+            <w:proofErr w:type="spellEnd"/>
+            <w:r>
+              <w:rPr>
+                <w:rFonts w:ascii="Arial" w:eastAsia="Times New Roman" w:hAnsi="Arial" w:cs="Arial"/>
+                <w:b/>
+                <w:szCs w:val="20"/>
+              </w:rPr>
+              <w:t xml:space="preserve"> </w:t>
             </w:r>
             <w:r>
               <w:rPr>
@@ -1186,7 +1224,16 @@
                 <w:b/>
                 <w:szCs w:val="20"/>
               </w:rPr>
-              <w:t xml:space="preserve"> a different G</w:t>
+              <w:t xml:space="preserve"> a different </w:t>
+            </w:r>
+            <w:proofErr w:type="spellStart"/>
+            <w:r>
+              <w:rPr>
+                <w:rFonts w:ascii="Arial" w:eastAsia="Times New Roman" w:hAnsi="Arial" w:cs="Arial"/>
+                <w:b/>
+                <w:szCs w:val="20"/>
+              </w:rPr>
+              <w:t>G</w:t>
             </w:r>
             <w:r>
               <w:rPr>
@@ -1202,7 +1249,16 @@
                 <w:b/>
                 <w:szCs w:val="20"/>
               </w:rPr>
-              <w:t>hub branch and test out the</w:t>
+              <w:t>hub</w:t>
+            </w:r>
+            <w:proofErr w:type="spellEnd"/>
+            <w:r>
+              <w:rPr>
+                <w:rFonts w:ascii="Arial" w:eastAsia="Times New Roman" w:hAnsi="Arial" w:cs="Arial"/>
+                <w:b/>
+                <w:szCs w:val="20"/>
+              </w:rPr>
+              <w:t xml:space="preserve"> branch and test out the</w:t>
             </w:r>
             <w:r>
               <w:rPr>
@@ -2351,8 +2407,18 @@
                 <w:sz w:val="20"/>
                 <w:szCs w:val="20"/>
               </w:rPr>
-              <w:t>Check with xyz</w:t>
-            </w:r>
+              <w:t xml:space="preserve">Check with </w:t>
+            </w:r>
+            <w:proofErr w:type="spellStart"/>
+            <w:r>
+              <w:rPr>
+                <w:rFonts w:ascii="Arial" w:eastAsia="Times New Roman" w:hAnsi="Arial" w:cs="Arial"/>
+                <w:sz w:val="20"/>
+                <w:szCs w:val="20"/>
+              </w:rPr>
+              <w:t>xyz</w:t>
+            </w:r>
+            <w:proofErr w:type="spellEnd"/>
           </w:p>
         </w:tc>
       </w:tr>
@@ -2647,16 +2713,25 @@
           <w:lang w:eastAsia="en-AU"/>
         </w:rPr>
       </w:pPr>
-    </w:p>
-    <w:p>
-      <w:pPr>
-        <w:spacing w:after="0" w:line="240" w:lineRule="auto"/>
+      <w:r>
         <w:rPr>
           <w:rFonts w:ascii="Times New Roman" w:eastAsia="Times New Roman" w:hAnsi="Times New Roman" w:cs="Times New Roman"/>
           <w:sz w:val="24"/>
           <w:szCs w:val="24"/>
           <w:lang w:eastAsia="en-AU"/>
         </w:rPr>
+        <w:t>summary</w:t>
+      </w:r>
+    </w:p>
+    <w:p>
+      <w:pPr>
+        <w:spacing w:after="0" w:line="240" w:lineRule="auto"/>
+        <w:rPr>
+          <w:rFonts w:ascii="Times New Roman" w:eastAsia="Times New Roman" w:hAnsi="Times New Roman" w:cs="Times New Roman"/>
+          <w:sz w:val="24"/>
+          <w:szCs w:val="24"/>
+          <w:lang w:eastAsia="en-AU"/>
+        </w:rPr>
       </w:pPr>
       <w:r>
         <w:rPr>
@@ -2676,7 +2751,29 @@
           <w:color w:val="000000"/>
           <w:lang w:eastAsia="en-AU"/>
         </w:rPr>
-        <w:t>any literature read and key things learned</w:t>
+        <w:t xml:space="preserve">any literature </w:t>
+      </w:r>
+      <w:proofErr w:type="gramStart"/>
+      <w:r>
+        <w:rPr>
+          <w:rFonts w:ascii="Arial" w:eastAsia="Times New Roman" w:hAnsi="Arial" w:cs="Arial"/>
+          <w:i/>
+          <w:iCs/>
+          <w:color w:val="000000"/>
+          <w:lang w:eastAsia="en-AU"/>
+        </w:rPr>
+        <w:t>read</w:t>
+      </w:r>
+      <w:proofErr w:type="gramEnd"/>
+      <w:r>
+        <w:rPr>
+          <w:rFonts w:ascii="Arial" w:eastAsia="Times New Roman" w:hAnsi="Arial" w:cs="Arial"/>
+          <w:i/>
+          <w:iCs/>
+          <w:color w:val="000000"/>
+          <w:lang w:eastAsia="en-AU"/>
+        </w:rPr>
+        <w:t xml:space="preserve"> and key things learned</w:t>
       </w:r>
     </w:p>
     <w:p>
@@ -3376,8 +3473,18 @@
                 <w:sz w:val="20"/>
                 <w:szCs w:val="20"/>
               </w:rPr>
-              <w:t>Check with xyz</w:t>
-            </w:r>
+              <w:t xml:space="preserve">Check with </w:t>
+            </w:r>
+            <w:proofErr w:type="spellStart"/>
+            <w:r>
+              <w:rPr>
+                <w:rFonts w:ascii="Arial" w:eastAsia="Times New Roman" w:hAnsi="Arial" w:cs="Arial"/>
+                <w:sz w:val="20"/>
+                <w:szCs w:val="20"/>
+              </w:rPr>
+              <w:t>xyz</w:t>
+            </w:r>
+            <w:proofErr w:type="spellEnd"/>
           </w:p>
         </w:tc>
       </w:tr>
@@ -3701,7 +3808,29 @@
           <w:color w:val="000000"/>
           <w:lang w:eastAsia="en-AU"/>
         </w:rPr>
-        <w:t>any literature read and key things learned</w:t>
+        <w:t xml:space="preserve">any literature </w:t>
+      </w:r>
+      <w:proofErr w:type="gramStart"/>
+      <w:r>
+        <w:rPr>
+          <w:rFonts w:ascii="Arial" w:eastAsia="Times New Roman" w:hAnsi="Arial" w:cs="Arial"/>
+          <w:i/>
+          <w:iCs/>
+          <w:color w:val="000000"/>
+          <w:lang w:eastAsia="en-AU"/>
+        </w:rPr>
+        <w:t>read</w:t>
+      </w:r>
+      <w:proofErr w:type="gramEnd"/>
+      <w:r>
+        <w:rPr>
+          <w:rFonts w:ascii="Arial" w:eastAsia="Times New Roman" w:hAnsi="Arial" w:cs="Arial"/>
+          <w:i/>
+          <w:iCs/>
+          <w:color w:val="000000"/>
+          <w:lang w:eastAsia="en-AU"/>
+        </w:rPr>
+        <w:t xml:space="preserve"> and key things learned</w:t>
       </w:r>
     </w:p>
     <w:p>
@@ -4407,8 +4536,18 @@
                 <w:sz w:val="20"/>
                 <w:szCs w:val="20"/>
               </w:rPr>
-              <w:t>Check with xyz</w:t>
-            </w:r>
+              <w:t xml:space="preserve">Check with </w:t>
+            </w:r>
+            <w:proofErr w:type="spellStart"/>
+            <w:r>
+              <w:rPr>
+                <w:rFonts w:ascii="Arial" w:eastAsia="Times New Roman" w:hAnsi="Arial" w:cs="Arial"/>
+                <w:sz w:val="20"/>
+                <w:szCs w:val="20"/>
+              </w:rPr>
+              <w:t>xyz</w:t>
+            </w:r>
+            <w:proofErr w:type="spellEnd"/>
           </w:p>
         </w:tc>
       </w:tr>
@@ -4732,7 +4871,29 @@
           <w:color w:val="000000"/>
           <w:lang w:eastAsia="en-AU"/>
         </w:rPr>
-        <w:t>any literature read and key things learned</w:t>
+        <w:t xml:space="preserve">any literature </w:t>
+      </w:r>
+      <w:proofErr w:type="gramStart"/>
+      <w:r>
+        <w:rPr>
+          <w:rFonts w:ascii="Arial" w:eastAsia="Times New Roman" w:hAnsi="Arial" w:cs="Arial"/>
+          <w:i/>
+          <w:iCs/>
+          <w:color w:val="000000"/>
+          <w:lang w:eastAsia="en-AU"/>
+        </w:rPr>
+        <w:t>read</w:t>
+      </w:r>
+      <w:proofErr w:type="gramEnd"/>
+      <w:r>
+        <w:rPr>
+          <w:rFonts w:ascii="Arial" w:eastAsia="Times New Roman" w:hAnsi="Arial" w:cs="Arial"/>
+          <w:i/>
+          <w:iCs/>
+          <w:color w:val="000000"/>
+          <w:lang w:eastAsia="en-AU"/>
+        </w:rPr>
+        <w:t xml:space="preserve"> and key things learned</w:t>
       </w:r>
     </w:p>
     <w:p>
@@ -5432,8 +5593,18 @@
                 <w:sz w:val="20"/>
                 <w:szCs w:val="20"/>
               </w:rPr>
-              <w:t>Check with xyz</w:t>
-            </w:r>
+              <w:t xml:space="preserve">Check with </w:t>
+            </w:r>
+            <w:proofErr w:type="spellStart"/>
+            <w:r>
+              <w:rPr>
+                <w:rFonts w:ascii="Arial" w:eastAsia="Times New Roman" w:hAnsi="Arial" w:cs="Arial"/>
+                <w:sz w:val="20"/>
+                <w:szCs w:val="20"/>
+              </w:rPr>
+              <w:t>xyz</w:t>
+            </w:r>
+            <w:proofErr w:type="spellEnd"/>
           </w:p>
         </w:tc>
       </w:tr>
@@ -5757,7 +5928,29 @@
           <w:color w:val="000000"/>
           <w:lang w:eastAsia="en-AU"/>
         </w:rPr>
-        <w:t>any literature read and key things learned</w:t>
+        <w:t xml:space="preserve">any literature </w:t>
+      </w:r>
+      <w:proofErr w:type="gramStart"/>
+      <w:r>
+        <w:rPr>
+          <w:rFonts w:ascii="Arial" w:eastAsia="Times New Roman" w:hAnsi="Arial" w:cs="Arial"/>
+          <w:i/>
+          <w:iCs/>
+          <w:color w:val="000000"/>
+          <w:lang w:eastAsia="en-AU"/>
+        </w:rPr>
+        <w:t>read</w:t>
+      </w:r>
+      <w:proofErr w:type="gramEnd"/>
+      <w:r>
+        <w:rPr>
+          <w:rFonts w:ascii="Arial" w:eastAsia="Times New Roman" w:hAnsi="Arial" w:cs="Arial"/>
+          <w:i/>
+          <w:iCs/>
+          <w:color w:val="000000"/>
+          <w:lang w:eastAsia="en-AU"/>
+        </w:rPr>
+        <w:t xml:space="preserve"> and key things learned</w:t>
       </w:r>
     </w:p>
     <w:p>
@@ -6457,8 +6650,18 @@
                 <w:sz w:val="20"/>
                 <w:szCs w:val="20"/>
               </w:rPr>
-              <w:t>Check with xyz</w:t>
-            </w:r>
+              <w:t xml:space="preserve">Check with </w:t>
+            </w:r>
+            <w:proofErr w:type="spellStart"/>
+            <w:r>
+              <w:rPr>
+                <w:rFonts w:ascii="Arial" w:eastAsia="Times New Roman" w:hAnsi="Arial" w:cs="Arial"/>
+                <w:sz w:val="20"/>
+                <w:szCs w:val="20"/>
+              </w:rPr>
+              <w:t>xyz</w:t>
+            </w:r>
+            <w:proofErr w:type="spellEnd"/>
           </w:p>
         </w:tc>
       </w:tr>
@@ -6782,7 +6985,29 @@
           <w:color w:val="000000"/>
           <w:lang w:eastAsia="en-AU"/>
         </w:rPr>
-        <w:t>any literature read and key things learned</w:t>
+        <w:t xml:space="preserve">any literature </w:t>
+      </w:r>
+      <w:proofErr w:type="gramStart"/>
+      <w:r>
+        <w:rPr>
+          <w:rFonts w:ascii="Arial" w:eastAsia="Times New Roman" w:hAnsi="Arial" w:cs="Arial"/>
+          <w:i/>
+          <w:iCs/>
+          <w:color w:val="000000"/>
+          <w:lang w:eastAsia="en-AU"/>
+        </w:rPr>
+        <w:t>read</w:t>
+      </w:r>
+      <w:proofErr w:type="gramEnd"/>
+      <w:r>
+        <w:rPr>
+          <w:rFonts w:ascii="Arial" w:eastAsia="Times New Roman" w:hAnsi="Arial" w:cs="Arial"/>
+          <w:i/>
+          <w:iCs/>
+          <w:color w:val="000000"/>
+          <w:lang w:eastAsia="en-AU"/>
+        </w:rPr>
+        <w:t xml:space="preserve"> and key things learned</w:t>
       </w:r>
     </w:p>
     <w:p>
@@ -7482,8 +7707,18 @@
                 <w:sz w:val="20"/>
                 <w:szCs w:val="20"/>
               </w:rPr>
-              <w:t>Check with xyz</w:t>
-            </w:r>
+              <w:t xml:space="preserve">Check with </w:t>
+            </w:r>
+            <w:proofErr w:type="spellStart"/>
+            <w:r>
+              <w:rPr>
+                <w:rFonts w:ascii="Arial" w:eastAsia="Times New Roman" w:hAnsi="Arial" w:cs="Arial"/>
+                <w:sz w:val="20"/>
+                <w:szCs w:val="20"/>
+              </w:rPr>
+              <w:t>xyz</w:t>
+            </w:r>
+            <w:proofErr w:type="spellEnd"/>
           </w:p>
         </w:tc>
       </w:tr>
@@ -7807,7 +8042,29 @@
           <w:color w:val="000000"/>
           <w:lang w:eastAsia="en-AU"/>
         </w:rPr>
-        <w:t>any literature read and key things learned</w:t>
+        <w:t xml:space="preserve">any literature </w:t>
+      </w:r>
+      <w:proofErr w:type="gramStart"/>
+      <w:r>
+        <w:rPr>
+          <w:rFonts w:ascii="Arial" w:eastAsia="Times New Roman" w:hAnsi="Arial" w:cs="Arial"/>
+          <w:i/>
+          <w:iCs/>
+          <w:color w:val="000000"/>
+          <w:lang w:eastAsia="en-AU"/>
+        </w:rPr>
+        <w:t>read</w:t>
+      </w:r>
+      <w:proofErr w:type="gramEnd"/>
+      <w:r>
+        <w:rPr>
+          <w:rFonts w:ascii="Arial" w:eastAsia="Times New Roman" w:hAnsi="Arial" w:cs="Arial"/>
+          <w:i/>
+          <w:iCs/>
+          <w:color w:val="000000"/>
+          <w:lang w:eastAsia="en-AU"/>
+        </w:rPr>
+        <w:t xml:space="preserve"> and key things learned</w:t>
       </w:r>
     </w:p>
     <w:p>
@@ -8507,8 +8764,18 @@
                 <w:sz w:val="20"/>
                 <w:szCs w:val="20"/>
               </w:rPr>
-              <w:t>Check with xyz</w:t>
-            </w:r>
+              <w:t xml:space="preserve">Check with </w:t>
+            </w:r>
+            <w:proofErr w:type="spellStart"/>
+            <w:r>
+              <w:rPr>
+                <w:rFonts w:ascii="Arial" w:eastAsia="Times New Roman" w:hAnsi="Arial" w:cs="Arial"/>
+                <w:sz w:val="20"/>
+                <w:szCs w:val="20"/>
+              </w:rPr>
+              <w:t>xyz</w:t>
+            </w:r>
+            <w:proofErr w:type="spellEnd"/>
           </w:p>
         </w:tc>
       </w:tr>
@@ -8832,7 +9099,29 @@
           <w:color w:val="000000"/>
           <w:lang w:eastAsia="en-AU"/>
         </w:rPr>
-        <w:t>any literature read and key things learned</w:t>
+        <w:t xml:space="preserve">any literature </w:t>
+      </w:r>
+      <w:proofErr w:type="gramStart"/>
+      <w:r>
+        <w:rPr>
+          <w:rFonts w:ascii="Arial" w:eastAsia="Times New Roman" w:hAnsi="Arial" w:cs="Arial"/>
+          <w:i/>
+          <w:iCs/>
+          <w:color w:val="000000"/>
+          <w:lang w:eastAsia="en-AU"/>
+        </w:rPr>
+        <w:t>read</w:t>
+      </w:r>
+      <w:proofErr w:type="gramEnd"/>
+      <w:r>
+        <w:rPr>
+          <w:rFonts w:ascii="Arial" w:eastAsia="Times New Roman" w:hAnsi="Arial" w:cs="Arial"/>
+          <w:i/>
+          <w:iCs/>
+          <w:color w:val="000000"/>
+          <w:lang w:eastAsia="en-AU"/>
+        </w:rPr>
+        <w:t xml:space="preserve"> and key things learned</w:t>
       </w:r>
     </w:p>
     <w:p>
@@ -9532,8 +9821,18 @@
                 <w:sz w:val="20"/>
                 <w:szCs w:val="20"/>
               </w:rPr>
-              <w:t>Check with xyz</w:t>
-            </w:r>
+              <w:t xml:space="preserve">Check with </w:t>
+            </w:r>
+            <w:proofErr w:type="spellStart"/>
+            <w:r>
+              <w:rPr>
+                <w:rFonts w:ascii="Arial" w:eastAsia="Times New Roman" w:hAnsi="Arial" w:cs="Arial"/>
+                <w:sz w:val="20"/>
+                <w:szCs w:val="20"/>
+              </w:rPr>
+              <w:t>xyz</w:t>
+            </w:r>
+            <w:proofErr w:type="spellEnd"/>
           </w:p>
         </w:tc>
       </w:tr>
@@ -9857,7 +10156,29 @@
           <w:color w:val="000000"/>
           <w:lang w:eastAsia="en-AU"/>
         </w:rPr>
-        <w:t>any literature read and key things learned</w:t>
+        <w:t xml:space="preserve">any literature </w:t>
+      </w:r>
+      <w:proofErr w:type="gramStart"/>
+      <w:r>
+        <w:rPr>
+          <w:rFonts w:ascii="Arial" w:eastAsia="Times New Roman" w:hAnsi="Arial" w:cs="Arial"/>
+          <w:i/>
+          <w:iCs/>
+          <w:color w:val="000000"/>
+          <w:lang w:eastAsia="en-AU"/>
+        </w:rPr>
+        <w:t>read</w:t>
+      </w:r>
+      <w:proofErr w:type="gramEnd"/>
+      <w:r>
+        <w:rPr>
+          <w:rFonts w:ascii="Arial" w:eastAsia="Times New Roman" w:hAnsi="Arial" w:cs="Arial"/>
+          <w:i/>
+          <w:iCs/>
+          <w:color w:val="000000"/>
+          <w:lang w:eastAsia="en-AU"/>
+        </w:rPr>
+        <w:t xml:space="preserve"> and key things learned</w:t>
       </w:r>
     </w:p>
     <w:p>
@@ -10557,8 +10878,18 @@
                 <w:sz w:val="20"/>
                 <w:szCs w:val="20"/>
               </w:rPr>
-              <w:t>Check with xyz</w:t>
-            </w:r>
+              <w:t xml:space="preserve">Check with </w:t>
+            </w:r>
+            <w:proofErr w:type="spellStart"/>
+            <w:r>
+              <w:rPr>
+                <w:rFonts w:ascii="Arial" w:eastAsia="Times New Roman" w:hAnsi="Arial" w:cs="Arial"/>
+                <w:sz w:val="20"/>
+                <w:szCs w:val="20"/>
+              </w:rPr>
+              <w:t>xyz</w:t>
+            </w:r>
+            <w:proofErr w:type="spellEnd"/>
           </w:p>
         </w:tc>
       </w:tr>
@@ -10882,7 +11213,29 @@
           <w:color w:val="000000"/>
           <w:lang w:eastAsia="en-AU"/>
         </w:rPr>
-        <w:t>any literature read and key things learned</w:t>
+        <w:t xml:space="preserve">any literature </w:t>
+      </w:r>
+      <w:proofErr w:type="gramStart"/>
+      <w:r>
+        <w:rPr>
+          <w:rFonts w:ascii="Arial" w:eastAsia="Times New Roman" w:hAnsi="Arial" w:cs="Arial"/>
+          <w:i/>
+          <w:iCs/>
+          <w:color w:val="000000"/>
+          <w:lang w:eastAsia="en-AU"/>
+        </w:rPr>
+        <w:t>read</w:t>
+      </w:r>
+      <w:proofErr w:type="gramEnd"/>
+      <w:r>
+        <w:rPr>
+          <w:rFonts w:ascii="Arial" w:eastAsia="Times New Roman" w:hAnsi="Arial" w:cs="Arial"/>
+          <w:i/>
+          <w:iCs/>
+          <w:color w:val="000000"/>
+          <w:lang w:eastAsia="en-AU"/>
+        </w:rPr>
+        <w:t xml:space="preserve"> and key things learned</w:t>
       </w:r>
     </w:p>
     <w:p>
@@ -11591,8 +11944,18 @@
                 <w:sz w:val="20"/>
                 <w:szCs w:val="20"/>
               </w:rPr>
-              <w:t>Check with xyz</w:t>
-            </w:r>
+              <w:t xml:space="preserve">Check with </w:t>
+            </w:r>
+            <w:proofErr w:type="spellStart"/>
+            <w:r>
+              <w:rPr>
+                <w:rFonts w:ascii="Arial" w:eastAsia="Times New Roman" w:hAnsi="Arial" w:cs="Arial"/>
+                <w:sz w:val="20"/>
+                <w:szCs w:val="20"/>
+              </w:rPr>
+              <w:t>xyz</w:t>
+            </w:r>
+            <w:proofErr w:type="spellEnd"/>
           </w:p>
         </w:tc>
       </w:tr>
@@ -11916,7 +12279,29 @@
           <w:color w:val="000000"/>
           <w:lang w:eastAsia="en-AU"/>
         </w:rPr>
-        <w:t>any literature read and key things learned</w:t>
+        <w:t xml:space="preserve">any literature </w:t>
+      </w:r>
+      <w:proofErr w:type="gramStart"/>
+      <w:r>
+        <w:rPr>
+          <w:rFonts w:ascii="Arial" w:eastAsia="Times New Roman" w:hAnsi="Arial" w:cs="Arial"/>
+          <w:i/>
+          <w:iCs/>
+          <w:color w:val="000000"/>
+          <w:lang w:eastAsia="en-AU"/>
+        </w:rPr>
+        <w:t>read</w:t>
+      </w:r>
+      <w:proofErr w:type="gramEnd"/>
+      <w:r>
+        <w:rPr>
+          <w:rFonts w:ascii="Arial" w:eastAsia="Times New Roman" w:hAnsi="Arial" w:cs="Arial"/>
+          <w:i/>
+          <w:iCs/>
+          <w:color w:val="000000"/>
+          <w:lang w:eastAsia="en-AU"/>
+        </w:rPr>
+        <w:t xml:space="preserve"> and key things learned</w:t>
       </w:r>
     </w:p>
     <w:p>
@@ -12625,8 +13010,18 @@
                 <w:sz w:val="20"/>
                 <w:szCs w:val="20"/>
               </w:rPr>
-              <w:t>Check with xyz</w:t>
-            </w:r>
+              <w:t xml:space="preserve">Check with </w:t>
+            </w:r>
+            <w:proofErr w:type="spellStart"/>
+            <w:r>
+              <w:rPr>
+                <w:rFonts w:ascii="Arial" w:eastAsia="Times New Roman" w:hAnsi="Arial" w:cs="Arial"/>
+                <w:sz w:val="20"/>
+                <w:szCs w:val="20"/>
+              </w:rPr>
+              <w:t>xyz</w:t>
+            </w:r>
+            <w:proofErr w:type="spellEnd"/>
           </w:p>
         </w:tc>
       </w:tr>
@@ -12950,7 +13345,29 @@
           <w:color w:val="000000"/>
           <w:lang w:eastAsia="en-AU"/>
         </w:rPr>
-        <w:t>any literature read and key things learned</w:t>
+        <w:t xml:space="preserve">any literature </w:t>
+      </w:r>
+      <w:proofErr w:type="gramStart"/>
+      <w:r>
+        <w:rPr>
+          <w:rFonts w:ascii="Arial" w:eastAsia="Times New Roman" w:hAnsi="Arial" w:cs="Arial"/>
+          <w:i/>
+          <w:iCs/>
+          <w:color w:val="000000"/>
+          <w:lang w:eastAsia="en-AU"/>
+        </w:rPr>
+        <w:t>read</w:t>
+      </w:r>
+      <w:proofErr w:type="gramEnd"/>
+      <w:r>
+        <w:rPr>
+          <w:rFonts w:ascii="Arial" w:eastAsia="Times New Roman" w:hAnsi="Arial" w:cs="Arial"/>
+          <w:i/>
+          <w:iCs/>
+          <w:color w:val="000000"/>
+          <w:lang w:eastAsia="en-AU"/>
+        </w:rPr>
+        <w:t xml:space="preserve"> and key things learned</w:t>
       </w:r>
     </w:p>
     <w:p>
@@ -13659,8 +14076,18 @@
                 <w:sz w:val="20"/>
                 <w:szCs w:val="20"/>
               </w:rPr>
-              <w:t>Check with xyz</w:t>
-            </w:r>
+              <w:t xml:space="preserve">Check with </w:t>
+            </w:r>
+            <w:proofErr w:type="spellStart"/>
+            <w:r>
+              <w:rPr>
+                <w:rFonts w:ascii="Arial" w:eastAsia="Times New Roman" w:hAnsi="Arial" w:cs="Arial"/>
+                <w:sz w:val="20"/>
+                <w:szCs w:val="20"/>
+              </w:rPr>
+              <w:t>xyz</w:t>
+            </w:r>
+            <w:proofErr w:type="spellEnd"/>
           </w:p>
         </w:tc>
       </w:tr>
@@ -13984,7 +14411,29 @@
           <w:color w:val="000000"/>
           <w:lang w:eastAsia="en-AU"/>
         </w:rPr>
-        <w:t>any literature read and key things learned</w:t>
+        <w:t xml:space="preserve">any literature </w:t>
+      </w:r>
+      <w:proofErr w:type="gramStart"/>
+      <w:r>
+        <w:rPr>
+          <w:rFonts w:ascii="Arial" w:eastAsia="Times New Roman" w:hAnsi="Arial" w:cs="Arial"/>
+          <w:i/>
+          <w:iCs/>
+          <w:color w:val="000000"/>
+          <w:lang w:eastAsia="en-AU"/>
+        </w:rPr>
+        <w:t>read</w:t>
+      </w:r>
+      <w:proofErr w:type="gramEnd"/>
+      <w:r>
+        <w:rPr>
+          <w:rFonts w:ascii="Arial" w:eastAsia="Times New Roman" w:hAnsi="Arial" w:cs="Arial"/>
+          <w:i/>
+          <w:iCs/>
+          <w:color w:val="000000"/>
+          <w:lang w:eastAsia="en-AU"/>
+        </w:rPr>
+        <w:t xml:space="preserve"> and key things learned</w:t>
       </w:r>
     </w:p>
     <w:p>
@@ -14764,6 +15213,7 @@
       </w:rPr>
       <w:t xml:space="preserve"> </w:t>
     </w:r>
+    <w:proofErr w:type="spellStart"/>
     <w:r>
       <w:rPr>
         <w:rFonts w:ascii="Arial" w:eastAsia="Times New Roman" w:hAnsi="Arial" w:cs="Arial"/>
@@ -14775,6 +15225,7 @@
       </w:rPr>
       <w:t>A</w:t>
     </w:r>
+    <w:proofErr w:type="spellEnd"/>
     <w:r>
       <w:rPr>
         <w:rFonts w:ascii="Arial" w:eastAsia="Times New Roman" w:hAnsi="Arial" w:cs="Arial"/>

</xml_diff>